<commit_message>
feat: Adicao estorias do usuario
</commit_message>
<xml_diff>
--- a/ApêndiceB-Requisitos/PID_EstóriasdoUsuário.docx
+++ b/ApêndiceB-Requisitos/PID_EstóriasdoUsuário.docx
@@ -2,44 +2,45 @@
 <file path=word/document.xml><?xml version="1.0" encoding="utf-8"?>
 <w:document xmlns:wpc="http://schemas.microsoft.com/office/word/2010/wordprocessingCanvas" xmlns:cx="http://schemas.microsoft.com/office/drawing/2014/chartex" xmlns:cx1="http://schemas.microsoft.com/office/drawing/2015/9/8/chartex" xmlns:mc="http://schemas.openxmlformats.org/markup-compatibility/2006" xmlns:o="urn:schemas-microsoft-com:office:office" xmlns:r="http://schemas.openxmlformats.org/officeDocument/2006/relationships" xmlns:m="http://schemas.openxmlformats.org/officeDocument/2006/math" xmlns:v="urn:schemas-microsoft-com:vml" xmlns:wp14="http://schemas.microsoft.com/office/word/2010/wordprocessingDrawing" xmlns:wp="http://schemas.openxmlformats.org/drawingml/2006/wordprocessingDrawing" xmlns:w10="urn:schemas-microsoft-com:office:word" xmlns:w="http://schemas.openxmlformats.org/wordprocessingml/2006/main" xmlns:w14="http://schemas.microsoft.com/office/word/2010/wordml" xmlns:w15="http://schemas.microsoft.com/office/word/2012/wordml" xmlns:w16se="http://schemas.microsoft.com/office/word/2015/wordml/symex" xmlns:wpg="http://schemas.microsoft.com/office/word/2010/wordprocessingGroup" xmlns:wpi="http://schemas.microsoft.com/office/word/2010/wordprocessingInk" xmlns:wne="http://schemas.microsoft.com/office/word/2006/wordml" xmlns:wps="http://schemas.microsoft.com/office/word/2010/wordprocessingShape" mc:Ignorable="w14 w15 w16se wp14">
   <w:body>
-    <w:p>
+    <w:p xmlns:wp14="http://schemas.microsoft.com/office/word/2010/wordml" wp14:textId="77777777">
       <w:pPr>
         <w:spacing w:after="160" w:line="259" w:lineRule="auto"/>
       </w:pPr>
     </w:p>
     <w:tbl>
       <w:tblPr>
-        <w:tblW w:w="9640" w:type="dxa"/>
+        <w:tblW w:w="9666" w:type="dxa"/>
         <w:tblInd w:w="-431" w:type="dxa"/>
         <w:tblBorders>
-          <w:top w:val="single" w:sz="4" w:space="0" w:color="000000"/>
-          <w:left w:val="single" w:sz="4" w:space="0" w:color="000000"/>
-          <w:bottom w:val="single" w:sz="4" w:space="0" w:color="000000"/>
-          <w:right w:val="single" w:sz="4" w:space="0" w:color="000000"/>
-          <w:insideH w:val="single" w:sz="4" w:space="0" w:color="000000"/>
-          <w:insideV w:val="single" w:sz="4" w:space="0" w:color="000000"/>
+          <w:top w:val="single" w:color="000000" w:themeColor="text1" w:sz="4" w:space="0"/>
+          <w:left w:val="single" w:color="000000" w:themeColor="text1" w:sz="4" w:space="0"/>
+          <w:bottom w:val="single" w:color="000000" w:themeColor="text1" w:sz="4" w:space="0"/>
+          <w:right w:val="single" w:color="000000" w:themeColor="text1" w:sz="4" w:space="0"/>
+          <w:insideH w:val="single" w:color="000000" w:themeColor="text1" w:sz="4" w:space="0"/>
+          <w:insideV w:val="single" w:color="000000" w:themeColor="text1" w:sz="4" w:space="0"/>
         </w:tblBorders>
         <w:tblLayout w:type="fixed"/>
         <w:tblLook w:val="0400" w:firstRow="0" w:lastRow="0" w:firstColumn="0" w:lastColumn="0" w:noHBand="0" w:noVBand="1"/>
       </w:tblPr>
       <w:tblGrid>
         <w:gridCol w:w="2637"/>
-        <w:gridCol w:w="3459"/>
-        <w:gridCol w:w="1843"/>
-        <w:gridCol w:w="1701"/>
+        <w:gridCol w:w="3255"/>
+        <w:gridCol w:w="2295"/>
+        <w:gridCol w:w="1479"/>
       </w:tblGrid>
-      <w:tr>
+      <w:tr xmlns:wp14="http://schemas.microsoft.com/office/word/2010/wordml" wp14:textId="77777777">
         <w:trPr>
           <w:trHeight w:val="336"/>
         </w:trPr>
         <w:tc>
           <w:tcPr>
-            <w:tcW w:w="6096" w:type="dxa"/>
+            <w:tcW w:w="5892" w:type="dxa"/>
             <w:gridSpan w:val="2"/>
             <w:shd w:val="clear" w:color="auto" w:fill="DBE5F1"/>
+            <w:tcMar/>
             <w:vAlign w:val="center"/>
           </w:tcPr>
-          <w:p>
+          <w:p wp14:textId="77777777">
             <w:pPr>
               <w:pStyle w:val="Ttulo1"/>
               <w:jc w:val="center"/>
@@ -72,22 +73,23 @@
         </w:tc>
         <w:tc>
           <w:tcPr>
-            <w:tcW w:w="1843" w:type="dxa"/>
+            <w:tcW w:w="2295" w:type="dxa"/>
             <w:shd w:val="clear" w:color="auto" w:fill="DBE5F1"/>
+            <w:tcMar/>
             <w:vAlign w:val="center"/>
           </w:tcPr>
-          <w:p>
+          <w:p wp14:textId="77777777">
             <w:pPr>
               <w:spacing w:after="0" w:line="240" w:lineRule="auto"/>
               <w:rPr>
-                <w:rFonts w:ascii="Times New Roman" w:eastAsia="Arial" w:hAnsi="Times New Roman" w:cs="Times New Roman"/>
-                <w:sz w:val="24"/>
-                <w:szCs w:val="24"/>
-              </w:rPr>
-            </w:pPr>
-            <w:r>
-              <w:rPr>
-                <w:rFonts w:ascii="Times New Roman" w:eastAsia="Arial" w:hAnsi="Times New Roman" w:cs="Times New Roman"/>
+                <w:rFonts w:ascii="Times New Roman" w:hAnsi="Times New Roman" w:eastAsia="Arial" w:cs="Times New Roman"/>
+                <w:sz w:val="24"/>
+                <w:szCs w:val="24"/>
+              </w:rPr>
+            </w:pPr>
+            <w:r>
+              <w:rPr>
+                <w:rFonts w:ascii="Times New Roman" w:hAnsi="Times New Roman" w:eastAsia="Arial" w:cs="Times New Roman"/>
                 <w:sz w:val="24"/>
                 <w:szCs w:val="24"/>
               </w:rPr>
@@ -95,7 +97,7 @@
             </w:r>
             <w:r>
               <w:rPr>
-                <w:rFonts w:ascii="Times New Roman" w:eastAsia="Arial" w:hAnsi="Times New Roman" w:cs="Times New Roman"/>
+                <w:rFonts w:ascii="Times New Roman" w:hAnsi="Times New Roman" w:eastAsia="Arial" w:cs="Times New Roman"/>
                 <w:sz w:val="24"/>
                 <w:szCs w:val="24"/>
               </w:rPr>
@@ -105,86 +107,106 @@
         </w:tc>
         <w:tc>
           <w:tcPr>
-            <w:tcW w:w="1701" w:type="dxa"/>
+            <w:tcW w:w="1479" w:type="dxa"/>
             <w:shd w:val="clear" w:color="auto" w:fill="DBE5F1"/>
+            <w:tcMar/>
             <w:vAlign w:val="center"/>
           </w:tcPr>
-          <w:p>
+          <w:p wp14:textId="1BFDA3AA">
+            <w:pPr>
+              <w:pStyle w:val="Normal"/>
+              <w:suppressLineNumbers w:val="0"/>
+              <w:bidi w:val="0"/>
+              <w:spacing w:before="0" w:beforeAutospacing="off" w:after="0" w:afterAutospacing="off" w:line="240" w:lineRule="auto"/>
+              <w:ind w:left="0" w:right="0"/>
+              <w:jc w:val="left"/>
+            </w:pPr>
+            <w:r>
+              <w:rPr>
+                <w:rFonts w:ascii="Times New Roman" w:hAnsi="Times New Roman" w:eastAsia="Arial" w:cs="Times New Roman"/>
+                <w:sz w:val="24"/>
+                <w:szCs w:val="24"/>
+              </w:rPr>
+              <w:t>20/03/2026</w:t>
+            </w:r>
+          </w:p>
+        </w:tc>
+      </w:tr>
+      <w:tr xmlns:wp14="http://schemas.microsoft.com/office/word/2010/wordml" wp14:textId="77777777">
+        <w:tc>
+          <w:tcPr>
+            <w:tcW w:w="2637" w:type="dxa"/>
+            <w:tcMar/>
+            <w:vAlign w:val="center"/>
+          </w:tcPr>
+          <w:p wp14:textId="77777777">
             <w:pPr>
               <w:spacing w:after="0" w:line="240" w:lineRule="auto"/>
               <w:rPr>
-                <w:rFonts w:ascii="Times New Roman" w:eastAsia="Arial" w:hAnsi="Times New Roman" w:cs="Times New Roman"/>
-                <w:sz w:val="24"/>
-                <w:szCs w:val="24"/>
-              </w:rPr>
-            </w:pPr>
+                <w:rFonts w:ascii="Times New Roman" w:hAnsi="Times New Roman" w:eastAsia="Arial" w:cs="Times New Roman"/>
+                <w:sz w:val="24"/>
+                <w:szCs w:val="24"/>
+              </w:rPr>
+            </w:pPr>
+            <w:r>
+              <w:rPr>
+                <w:rFonts w:ascii="Times New Roman" w:hAnsi="Times New Roman" w:eastAsia="Arial" w:cs="Times New Roman"/>
+                <w:sz w:val="24"/>
+                <w:szCs w:val="24"/>
+              </w:rPr>
+              <w:t>Nome do projeto:</w:t>
+            </w:r>
+          </w:p>
+        </w:tc>
+        <w:tc>
+          <w:tcPr>
+            <w:tcW w:w="7029" w:type="dxa"/>
+            <w:gridSpan w:val="3"/>
+            <w:tcMar/>
+            <w:vAlign w:val="center"/>
+          </w:tcPr>
+          <w:p wp14:textId="2ACED312">
+            <w:pPr>
+              <w:spacing w:after="0" w:line="240" w:lineRule="auto"/>
+              <w:rPr>
+                <w:rFonts w:ascii="Times New Roman" w:hAnsi="Times New Roman" w:eastAsia="Arial" w:cs="Times New Roman"/>
+                <w:sz w:val="24"/>
+                <w:szCs w:val="24"/>
+              </w:rPr>
+            </w:pPr>
+            <w:r>
+              <w:rPr>
+                <w:rFonts w:ascii="Times New Roman" w:hAnsi="Times New Roman" w:eastAsia="Arial" w:cs="Times New Roman"/>
+                <w:sz w:val="24"/>
+                <w:szCs w:val="24"/>
+              </w:rPr>
+              <w:t>Pet Link</w:t>
+            </w:r>
           </w:p>
         </w:tc>
       </w:tr>
-      <w:tr>
-        <w:tc>
-          <w:tcPr>
-            <w:tcW w:w="2637" w:type="dxa"/>
-            <w:vAlign w:val="center"/>
-          </w:tcPr>
-          <w:p>
-            <w:pPr>
-              <w:spacing w:after="0" w:line="240" w:lineRule="auto"/>
-              <w:rPr>
-                <w:rFonts w:ascii="Times New Roman" w:eastAsia="Arial" w:hAnsi="Times New Roman" w:cs="Times New Roman"/>
-                <w:sz w:val="24"/>
-                <w:szCs w:val="24"/>
-              </w:rPr>
-            </w:pPr>
-            <w:r>
-              <w:rPr>
-                <w:rFonts w:ascii="Times New Roman" w:eastAsia="Arial" w:hAnsi="Times New Roman" w:cs="Times New Roman"/>
-                <w:sz w:val="24"/>
-                <w:szCs w:val="24"/>
-              </w:rPr>
-              <w:t>Nome do projeto:</w:t>
-            </w:r>
-          </w:p>
-        </w:tc>
-        <w:tc>
-          <w:tcPr>
-            <w:tcW w:w="7003" w:type="dxa"/>
-            <w:gridSpan w:val="3"/>
-            <w:vAlign w:val="center"/>
-          </w:tcPr>
-          <w:p>
-            <w:pPr>
-              <w:spacing w:after="0" w:line="240" w:lineRule="auto"/>
-              <w:rPr>
-                <w:rFonts w:ascii="Times New Roman" w:eastAsia="Arial" w:hAnsi="Times New Roman" w:cs="Times New Roman"/>
-                <w:sz w:val="24"/>
-                <w:szCs w:val="24"/>
-              </w:rPr>
-            </w:pPr>
-          </w:p>
-        </w:tc>
-      </w:tr>
-      <w:tr>
+      <w:tr xmlns:wp14="http://schemas.microsoft.com/office/word/2010/wordml" wp14:textId="77777777">
         <w:tc>
           <w:tcPr>
             <w:tcW w:w="2637" w:type="dxa"/>
             <w:tcBorders>
-              <w:bottom w:val="single" w:sz="4" w:space="0" w:color="000000"/>
+              <w:bottom w:val="single" w:color="000000" w:themeColor="text1" w:sz="4" w:space="0"/>
             </w:tcBorders>
+            <w:tcMar/>
             <w:vAlign w:val="center"/>
           </w:tcPr>
-          <w:p>
+          <w:p wp14:textId="77777777">
             <w:pPr>
               <w:spacing w:after="0" w:line="240" w:lineRule="auto"/>
               <w:rPr>
-                <w:rFonts w:ascii="Times New Roman" w:eastAsia="Arial" w:hAnsi="Times New Roman" w:cs="Times New Roman"/>
-                <w:sz w:val="24"/>
-                <w:szCs w:val="24"/>
-              </w:rPr>
-            </w:pPr>
-            <w:r>
-              <w:rPr>
-                <w:rFonts w:ascii="Times New Roman" w:eastAsia="Arial" w:hAnsi="Times New Roman" w:cs="Times New Roman"/>
+                <w:rFonts w:ascii="Times New Roman" w:hAnsi="Times New Roman" w:eastAsia="Arial" w:cs="Times New Roman"/>
+                <w:sz w:val="24"/>
+                <w:szCs w:val="24"/>
+              </w:rPr>
+            </w:pPr>
+            <w:r>
+              <w:rPr>
+                <w:rFonts w:ascii="Times New Roman" w:hAnsi="Times New Roman" w:eastAsia="Arial" w:cs="Times New Roman"/>
                 <w:sz w:val="24"/>
                 <w:szCs w:val="24"/>
               </w:rPr>
@@ -192,53 +214,63 @@
             </w:r>
             <w:r>
               <w:rPr>
-                <w:rFonts w:ascii="Times New Roman" w:eastAsia="Arial" w:hAnsi="Times New Roman" w:cs="Times New Roman"/>
+                <w:rFonts w:ascii="Times New Roman" w:hAnsi="Times New Roman" w:eastAsia="Arial" w:cs="Times New Roman"/>
                 <w:sz w:val="24"/>
                 <w:szCs w:val="24"/>
               </w:rPr>
               <w:t>:</w:t>
             </w:r>
-            <w:bookmarkStart w:id="0" w:name="_GoBack"/>
+            <w:bookmarkStart w:name="_GoBack" w:id="0"/>
             <w:bookmarkEnd w:id="0"/>
           </w:p>
         </w:tc>
         <w:tc>
           <w:tcPr>
-            <w:tcW w:w="7003" w:type="dxa"/>
+            <w:tcW w:w="7029" w:type="dxa"/>
             <w:gridSpan w:val="3"/>
             <w:tcBorders>
-              <w:bottom w:val="single" w:sz="4" w:space="0" w:color="000000"/>
+              <w:bottom w:val="single" w:color="000000" w:themeColor="text1" w:sz="4" w:space="0"/>
             </w:tcBorders>
+            <w:tcMar/>
             <w:vAlign w:val="center"/>
           </w:tcPr>
-          <w:p>
+          <w:p wp14:textId="7B552E5C">
             <w:pPr>
               <w:spacing w:after="0" w:line="240" w:lineRule="auto"/>
               <w:rPr>
-                <w:rFonts w:ascii="Times New Roman" w:eastAsia="Arial" w:hAnsi="Times New Roman" w:cs="Times New Roman"/>
-                <w:sz w:val="24"/>
-                <w:szCs w:val="24"/>
-              </w:rPr>
-            </w:pPr>
+                <w:rFonts w:ascii="Times New Roman" w:hAnsi="Times New Roman" w:eastAsia="Arial" w:cs="Times New Roman"/>
+                <w:sz w:val="24"/>
+                <w:szCs w:val="24"/>
+              </w:rPr>
+            </w:pPr>
+            <w:r>
+              <w:rPr>
+                <w:rFonts w:ascii="Times New Roman" w:hAnsi="Times New Roman" w:eastAsia="Arial" w:cs="Times New Roman"/>
+                <w:sz w:val="24"/>
+                <w:szCs w:val="24"/>
+              </w:rPr>
+              <w:t>Bruno Neves Trigo</w:t>
+            </w:r>
           </w:p>
         </w:tc>
       </w:tr>
-      <w:tr>
+      <w:tr xmlns:wp14="http://schemas.microsoft.com/office/word/2010/wordml" wp14:textId="77777777">
         <w:trPr>
           <w:trHeight w:val="153"/>
         </w:trPr>
         <w:tc>
           <w:tcPr>
-            <w:tcW w:w="9640" w:type="dxa"/>
+            <w:tcW w:w="9666" w:type="dxa"/>
             <w:gridSpan w:val="4"/>
             <w:shd w:val="clear" w:color="auto" w:fill="DBE5F1"/>
+            <w:tcMar/>
             <w:vAlign w:val="center"/>
           </w:tcPr>
-          <w:p>
+          <w:p wp14:textId="77777777">
             <w:pPr>
               <w:spacing w:after="0" w:line="240" w:lineRule="auto"/>
               <w:rPr>
-                <w:rFonts w:ascii="Times New Roman" w:eastAsia="Arial" w:hAnsi="Times New Roman" w:cs="Times New Roman"/>
+                <w:rFonts w:ascii="Times New Roman" w:hAnsi="Times New Roman" w:eastAsia="Arial" w:cs="Times New Roman"/>
                 <w:sz w:val="24"/>
                 <w:szCs w:val="24"/>
               </w:rPr>
@@ -249,6 +281,872 @@
     </w:tbl>
     <w:p>
       <w:pPr>
+        <w:pStyle w:val="Normal"/>
+        <w:rPr>
+          <w:rFonts w:ascii="Times New Roman" w:hAnsi="Times New Roman" w:cs="Times New Roman"/>
+          <w:sz w:val="24"/>
+          <w:szCs w:val="24"/>
+          <w:lang w:eastAsia="pt-BR"/>
+        </w:rPr>
+      </w:pPr>
+    </w:p>
+    <w:p>
+      <w:pPr>
+        <w:pStyle w:val="Normal"/>
+        <w:rPr>
+          <w:rFonts w:ascii="Times New Roman" w:hAnsi="Times New Roman" w:cs="Times New Roman"/>
+          <w:sz w:val="24"/>
+          <w:szCs w:val="24"/>
+          <w:lang w:eastAsia="pt-BR"/>
+        </w:rPr>
+      </w:pPr>
+    </w:p>
+    <w:tbl>
+      <w:tblPr>
+        <w:tblStyle w:val="TableGrid"/>
+        <w:tblW w:w="8488" w:type="dxa"/>
+        <w:tblLook w:val="06A0" w:firstRow="1" w:lastRow="0" w:firstColumn="1" w:lastColumn="0" w:noHBand="1" w:noVBand="1"/>
+      </w:tblPr>
+      <w:tblGrid>
+        <w:gridCol w:w="2122"/>
+        <w:gridCol w:w="2122"/>
+        <w:gridCol w:w="2355"/>
+        <w:gridCol w:w="1889"/>
+      </w:tblGrid>
+      <w:tr>
+        <w:trPr>
+          <w:trHeight w:val="300"/>
+        </w:trPr>
+        <w:tc>
+          <w:tcPr>
+            <w:tcW w:w="2122" w:type="dxa"/>
+            <w:tcMar/>
+          </w:tcPr>
+          <w:p>
+            <w:pPr>
+              <w:pStyle w:val="Normal"/>
+              <w:jc w:val="center"/>
+              <w:rPr>
+                <w:rFonts w:ascii="Times New Roman" w:hAnsi="Times New Roman" w:eastAsia="Times New Roman" w:cs="Times New Roman"/>
+                <w:noProof w:val="0"/>
+                <w:sz w:val="24"/>
+                <w:szCs w:val="24"/>
+                <w:lang w:val="pt-BR"/>
+              </w:rPr>
+            </w:pPr>
+            <w:r>
+              <w:rPr>
+                <w:rFonts w:ascii="Lucida Console" w:hAnsi="Lucida Console" w:eastAsia="Lucida Console" w:cs="Lucida Console"/>
+                <w:b w:val="0"/>
+                <w:bCs w:val="0"/>
+                <w:i w:val="0"/>
+                <w:iCs w:val="0"/>
+                <w:caps w:val="0"/>
+                <w:smallCaps w:val="0"/>
+                <w:noProof w:val="0"/>
+                <w:color w:val="000000" w:themeColor="text1" w:themeTint="FF" w:themeShade="FF"/>
+                <w:sz w:val="24"/>
+                <w:szCs w:val="24"/>
+                <w:lang w:val="pt-BR"/>
+              </w:rPr>
+              <w:t>Como [papel]</w:t>
+            </w:r>
+          </w:p>
+        </w:tc>
+        <w:tc>
+          <w:tcPr>
+            <w:tcW w:w="2122" w:type="dxa"/>
+            <w:tcMar/>
+          </w:tcPr>
+          <w:p>
+            <w:pPr>
+              <w:pStyle w:val="Normal"/>
+              <w:jc w:val="center"/>
+              <w:rPr>
+                <w:rFonts w:ascii="Times New Roman" w:hAnsi="Times New Roman" w:eastAsia="Times New Roman" w:cs="Times New Roman"/>
+                <w:noProof w:val="0"/>
+                <w:sz w:val="24"/>
+                <w:szCs w:val="24"/>
+                <w:lang w:val="pt-BR"/>
+              </w:rPr>
+            </w:pPr>
+            <w:r>
+              <w:rPr>
+                <w:rFonts w:ascii="Lucida Console" w:hAnsi="Lucida Console" w:eastAsia="Lucida Console" w:cs="Lucida Console"/>
+                <w:b w:val="0"/>
+                <w:bCs w:val="0"/>
+                <w:i w:val="0"/>
+                <w:iCs w:val="0"/>
+                <w:caps w:val="0"/>
+                <w:smallCaps w:val="0"/>
+                <w:noProof w:val="0"/>
+                <w:color w:val="000000" w:themeColor="text1" w:themeTint="FF" w:themeShade="FF"/>
+                <w:sz w:val="24"/>
+                <w:szCs w:val="24"/>
+                <w:lang w:val="pt-BR"/>
+              </w:rPr>
+              <w:t>Eu Quero [o que]</w:t>
+            </w:r>
+          </w:p>
+        </w:tc>
+        <w:tc>
+          <w:tcPr>
+            <w:tcW w:w="2355" w:type="dxa"/>
+            <w:tcMar/>
+          </w:tcPr>
+          <w:p>
+            <w:pPr>
+              <w:pStyle w:val="Normal"/>
+              <w:jc w:val="center"/>
+              <w:rPr>
+                <w:rFonts w:ascii="Times New Roman" w:hAnsi="Times New Roman" w:eastAsia="Times New Roman" w:cs="Times New Roman"/>
+                <w:noProof w:val="0"/>
+                <w:sz w:val="24"/>
+                <w:szCs w:val="24"/>
+                <w:lang w:val="pt-BR"/>
+              </w:rPr>
+            </w:pPr>
+            <w:r>
+              <w:rPr>
+                <w:rFonts w:ascii="Lucida Console" w:hAnsi="Lucida Console" w:eastAsia="Lucida Console" w:cs="Lucida Console"/>
+                <w:b w:val="0"/>
+                <w:bCs w:val="0"/>
+                <w:i w:val="0"/>
+                <w:iCs w:val="0"/>
+                <w:caps w:val="0"/>
+                <w:smallCaps w:val="0"/>
+                <w:noProof w:val="0"/>
+                <w:color w:val="000000" w:themeColor="text1" w:themeTint="FF" w:themeShade="FF"/>
+                <w:sz w:val="24"/>
+                <w:szCs w:val="24"/>
+                <w:lang w:val="pt-BR"/>
+              </w:rPr>
+              <w:t>Para [por quê]</w:t>
+            </w:r>
+          </w:p>
+        </w:tc>
+        <w:tc>
+          <w:tcPr>
+            <w:tcW w:w="1889" w:type="dxa"/>
+            <w:tcMar/>
+          </w:tcPr>
+          <w:p>
+            <w:pPr>
+              <w:pStyle w:val="Normal"/>
+              <w:jc w:val="center"/>
+              <w:rPr>
+                <w:rFonts w:ascii="Times New Roman" w:hAnsi="Times New Roman" w:eastAsia="Times New Roman" w:cs="Times New Roman"/>
+                <w:noProof w:val="0"/>
+                <w:sz w:val="24"/>
+                <w:szCs w:val="24"/>
+                <w:lang w:val="pt-BR"/>
+              </w:rPr>
+            </w:pPr>
+            <w:r>
+              <w:rPr>
+                <w:rFonts w:ascii="Lucida Console" w:hAnsi="Lucida Console" w:eastAsia="Lucida Console" w:cs="Lucida Console"/>
+                <w:b w:val="0"/>
+                <w:bCs w:val="0"/>
+                <w:i w:val="0"/>
+                <w:iCs w:val="0"/>
+                <w:caps w:val="0"/>
+                <w:smallCaps w:val="0"/>
+                <w:noProof w:val="0"/>
+                <w:color w:val="000000" w:themeColor="text1" w:themeTint="FF" w:themeShade="FF"/>
+                <w:sz w:val="24"/>
+                <w:szCs w:val="24"/>
+                <w:lang w:val="pt-BR"/>
+              </w:rPr>
+              <w:t>Priorização</w:t>
+            </w:r>
+          </w:p>
+        </w:tc>
+      </w:tr>
+      <w:tr>
+        <w:trPr>
+          <w:trHeight w:val="300"/>
+        </w:trPr>
+        <w:tc>
+          <w:tcPr>
+            <w:tcW w:w="2122" w:type="dxa"/>
+            <w:tcMar/>
+          </w:tcPr>
+          <w:p>
+            <w:pPr>
+              <w:pStyle w:val="Normal"/>
+              <w:rPr>
+                <w:noProof w:val="0"/>
+                <w:lang w:val="pt-BR"/>
+              </w:rPr>
+            </w:pPr>
+            <w:r>
+              <w:rPr>
+                <w:noProof w:val="0"/>
+                <w:lang w:val="pt-BR"/>
+              </w:rPr>
+              <w:t xml:space="preserve">Como Desenvolvedor Eu </w:t>
+            </w:r>
+          </w:p>
+        </w:tc>
+        <w:tc>
+          <w:tcPr>
+            <w:tcW w:w="2122" w:type="dxa"/>
+            <w:tcMar/>
+          </w:tcPr>
+          <w:p>
+            <w:pPr>
+              <w:pStyle w:val="Normal"/>
+              <w:suppressLineNumbers w:val="0"/>
+              <w:bidi w:val="0"/>
+              <w:spacing w:before="0" w:beforeAutospacing="off" w:after="200" w:afterAutospacing="off" w:line="276" w:lineRule="auto"/>
+              <w:ind w:left="0" w:right="0"/>
+              <w:jc w:val="left"/>
+            </w:pPr>
+            <w:r>
+              <w:rPr>
+                <w:rFonts w:ascii="Times New Roman" w:hAnsi="Times New Roman" w:cs="Times New Roman"/>
+                <w:sz w:val="22"/>
+                <w:szCs w:val="22"/>
+                <w:lang w:eastAsia="pt-BR"/>
+              </w:rPr>
+              <w:t>O usuário possa acessar todos os dados de vacinação do seu pet.</w:t>
+            </w:r>
+          </w:p>
+        </w:tc>
+        <w:tc>
+          <w:tcPr>
+            <w:tcW w:w="2355" w:type="dxa"/>
+            <w:tcMar/>
+          </w:tcPr>
+          <w:p>
+            <w:pPr>
+              <w:pStyle w:val="Normal"/>
+              <w:jc w:val="left"/>
+              <w:rPr>
+                <w:rFonts w:ascii="Times New Roman" w:hAnsi="Times New Roman" w:cs="Times New Roman"/>
+                <w:sz w:val="22"/>
+                <w:szCs w:val="22"/>
+                <w:lang w:eastAsia="pt-BR"/>
+              </w:rPr>
+            </w:pPr>
+            <w:r>
+              <w:rPr>
+                <w:rFonts w:ascii="Times New Roman" w:hAnsi="Times New Roman" w:cs="Times New Roman"/>
+                <w:sz w:val="22"/>
+                <w:szCs w:val="22"/>
+                <w:lang w:eastAsia="pt-BR"/>
+              </w:rPr>
+              <w:t>Para facilidade em controle de vacinação e saúde do animal.</w:t>
+            </w:r>
+          </w:p>
+        </w:tc>
+        <w:tc>
+          <w:tcPr>
+            <w:tcW w:w="1889" w:type="dxa"/>
+            <w:tcMar/>
+          </w:tcPr>
+          <w:p>
+            <w:pPr>
+              <w:pStyle w:val="Normal"/>
+              <w:spacing w:line="276" w:lineRule="auto"/>
+              <w:jc w:val="center"/>
+              <w:rPr>
+                <w:rFonts w:ascii="Times New Roman" w:hAnsi="Times New Roman" w:cs="Times New Roman"/>
+                <w:sz w:val="22"/>
+                <w:szCs w:val="22"/>
+                <w:lang w:eastAsia="pt-BR"/>
+              </w:rPr>
+            </w:pPr>
+            <w:r>
+              <w:rPr>
+                <w:rFonts w:ascii="Times New Roman" w:hAnsi="Times New Roman" w:cs="Times New Roman"/>
+                <w:sz w:val="22"/>
+                <w:szCs w:val="22"/>
+                <w:lang w:eastAsia="pt-BR"/>
+              </w:rPr>
+              <w:t>Alto</w:t>
+            </w:r>
+          </w:p>
+        </w:tc>
+      </w:tr>
+      <w:tr>
+        <w:trPr>
+          <w:trHeight w:val="300"/>
+        </w:trPr>
+        <w:tc>
+          <w:tcPr>
+            <w:tcW w:w="2122" w:type="dxa"/>
+            <w:tcMar/>
+          </w:tcPr>
+          <w:p>
+            <w:pPr>
+              <w:pStyle w:val="Normal"/>
+              <w:rPr>
+                <w:noProof w:val="0"/>
+                <w:lang w:val="pt-BR"/>
+              </w:rPr>
+            </w:pPr>
+            <w:r>
+              <w:rPr>
+                <w:noProof w:val="0"/>
+                <w:lang w:val="pt-BR"/>
+              </w:rPr>
+              <w:t>Como Desenvolvedor Eu</w:t>
+            </w:r>
+          </w:p>
+          <w:p>
+            <w:pPr>
+              <w:pStyle w:val="Normal"/>
+              <w:jc w:val="left"/>
+              <w:rPr>
+                <w:rFonts w:ascii="Times New Roman" w:hAnsi="Times New Roman" w:cs="Times New Roman"/>
+                <w:sz w:val="22"/>
+                <w:szCs w:val="22"/>
+                <w:lang w:eastAsia="pt-BR"/>
+              </w:rPr>
+            </w:pPr>
+          </w:p>
+        </w:tc>
+        <w:tc>
+          <w:tcPr>
+            <w:tcW w:w="2122" w:type="dxa"/>
+            <w:tcMar/>
+          </w:tcPr>
+          <w:p>
+            <w:pPr>
+              <w:pStyle w:val="Normal"/>
+              <w:jc w:val="left"/>
+              <w:rPr>
+                <w:rFonts w:ascii="Times New Roman" w:hAnsi="Times New Roman" w:cs="Times New Roman"/>
+                <w:sz w:val="22"/>
+                <w:szCs w:val="22"/>
+                <w:lang w:eastAsia="pt-BR"/>
+              </w:rPr>
+            </w:pPr>
+            <w:r>
+              <w:rPr>
+                <w:rFonts w:ascii="Times New Roman" w:hAnsi="Times New Roman" w:cs="Times New Roman"/>
+                <w:sz w:val="22"/>
+                <w:szCs w:val="22"/>
+                <w:lang w:eastAsia="pt-BR"/>
+              </w:rPr>
+              <w:t>Consiga cadastrar mais de um pet na mesma família</w:t>
+            </w:r>
+          </w:p>
+        </w:tc>
+        <w:tc>
+          <w:tcPr>
+            <w:tcW w:w="2355" w:type="dxa"/>
+            <w:tcMar/>
+          </w:tcPr>
+          <w:p>
+            <w:pPr>
+              <w:pStyle w:val="Normal"/>
+              <w:jc w:val="left"/>
+              <w:rPr>
+                <w:rFonts w:ascii="Times New Roman" w:hAnsi="Times New Roman" w:cs="Times New Roman"/>
+                <w:sz w:val="22"/>
+                <w:szCs w:val="22"/>
+                <w:lang w:eastAsia="pt-BR"/>
+              </w:rPr>
+            </w:pPr>
+            <w:r>
+              <w:rPr>
+                <w:rFonts w:ascii="Times New Roman" w:hAnsi="Times New Roman" w:cs="Times New Roman"/>
+                <w:sz w:val="22"/>
+                <w:szCs w:val="22"/>
+                <w:lang w:eastAsia="pt-BR"/>
+              </w:rPr>
+              <w:t xml:space="preserve">Montar uma “rede social” para seus pets de forma que </w:t>
+            </w:r>
+            <w:r>
+              <w:rPr>
+                <w:rFonts w:ascii="Times New Roman" w:hAnsi="Times New Roman" w:cs="Times New Roman"/>
+                <w:sz w:val="22"/>
+                <w:szCs w:val="22"/>
+                <w:lang w:eastAsia="pt-BR"/>
+              </w:rPr>
+              <w:t>possa interagir com outros criadores</w:t>
+            </w:r>
+          </w:p>
+        </w:tc>
+        <w:tc>
+          <w:tcPr>
+            <w:tcW w:w="1889" w:type="dxa"/>
+            <w:tcMar/>
+          </w:tcPr>
+          <w:p>
+            <w:pPr>
+              <w:pStyle w:val="Normal"/>
+              <w:jc w:val="center"/>
+              <w:rPr>
+                <w:rFonts w:ascii="Times New Roman" w:hAnsi="Times New Roman" w:cs="Times New Roman"/>
+                <w:sz w:val="22"/>
+                <w:szCs w:val="22"/>
+                <w:lang w:eastAsia="pt-BR"/>
+              </w:rPr>
+            </w:pPr>
+            <w:r>
+              <w:rPr>
+                <w:rFonts w:ascii="Times New Roman" w:hAnsi="Times New Roman" w:cs="Times New Roman"/>
+                <w:sz w:val="22"/>
+                <w:szCs w:val="22"/>
+                <w:lang w:eastAsia="pt-BR"/>
+              </w:rPr>
+              <w:t>Alto</w:t>
+            </w:r>
+          </w:p>
+        </w:tc>
+      </w:tr>
+      <w:tr>
+        <w:trPr>
+          <w:trHeight w:val="300"/>
+        </w:trPr>
+        <w:tc>
+          <w:tcPr>
+            <w:tcW w:w="2122" w:type="dxa"/>
+            <w:tcMar/>
+          </w:tcPr>
+          <w:p>
+            <w:pPr>
+              <w:pStyle w:val="Normal"/>
+              <w:rPr>
+                <w:noProof w:val="0"/>
+                <w:lang w:val="pt-BR"/>
+              </w:rPr>
+            </w:pPr>
+            <w:r>
+              <w:rPr>
+                <w:noProof w:val="0"/>
+                <w:lang w:val="pt-BR"/>
+              </w:rPr>
+              <w:t>Como Desenvolvedor Eu</w:t>
+            </w:r>
+          </w:p>
+          <w:p>
+            <w:pPr>
+              <w:pStyle w:val="Normal"/>
+              <w:jc w:val="left"/>
+              <w:rPr>
+                <w:rFonts w:ascii="Times New Roman" w:hAnsi="Times New Roman" w:cs="Times New Roman"/>
+                <w:sz w:val="22"/>
+                <w:szCs w:val="22"/>
+                <w:lang w:eastAsia="pt-BR"/>
+              </w:rPr>
+            </w:pPr>
+          </w:p>
+        </w:tc>
+        <w:tc>
+          <w:tcPr>
+            <w:tcW w:w="2122" w:type="dxa"/>
+            <w:tcMar/>
+          </w:tcPr>
+          <w:p>
+            <w:pPr>
+              <w:pStyle w:val="Normal"/>
+              <w:jc w:val="left"/>
+              <w:rPr>
+                <w:rFonts w:ascii="Times New Roman" w:hAnsi="Times New Roman" w:cs="Times New Roman"/>
+                <w:sz w:val="22"/>
+                <w:szCs w:val="22"/>
+                <w:lang w:eastAsia="pt-BR"/>
+              </w:rPr>
+            </w:pPr>
+            <w:r>
+              <w:rPr>
+                <w:rFonts w:ascii="Times New Roman" w:hAnsi="Times New Roman" w:cs="Times New Roman"/>
+                <w:sz w:val="22"/>
+                <w:szCs w:val="22"/>
+                <w:lang w:eastAsia="pt-BR"/>
+              </w:rPr>
+              <w:t xml:space="preserve">Que o usuário seja obrigado a realizar um login para </w:t>
+            </w:r>
+            <w:r>
+              <w:rPr>
+                <w:rFonts w:ascii="Times New Roman" w:hAnsi="Times New Roman" w:cs="Times New Roman"/>
+                <w:sz w:val="22"/>
+                <w:szCs w:val="22"/>
+                <w:lang w:eastAsia="pt-BR"/>
+              </w:rPr>
+              <w:t>interagir com o sistema</w:t>
+            </w:r>
+          </w:p>
+        </w:tc>
+        <w:tc>
+          <w:tcPr>
+            <w:tcW w:w="2355" w:type="dxa"/>
+            <w:tcMar/>
+          </w:tcPr>
+          <w:p>
+            <w:pPr>
+              <w:pStyle w:val="Normal"/>
+              <w:jc w:val="left"/>
+              <w:rPr>
+                <w:rFonts w:ascii="Times New Roman" w:hAnsi="Times New Roman" w:cs="Times New Roman"/>
+                <w:sz w:val="22"/>
+                <w:szCs w:val="22"/>
+                <w:lang w:eastAsia="pt-BR"/>
+              </w:rPr>
+            </w:pPr>
+            <w:r>
+              <w:rPr>
+                <w:rFonts w:ascii="Times New Roman" w:hAnsi="Times New Roman" w:cs="Times New Roman"/>
+                <w:sz w:val="22"/>
+                <w:szCs w:val="22"/>
+                <w:lang w:eastAsia="pt-BR"/>
+              </w:rPr>
+              <w:t>Se tenha segurança em todas as informações adicionadas no sistema</w:t>
+            </w:r>
+          </w:p>
+        </w:tc>
+        <w:tc>
+          <w:tcPr>
+            <w:tcW w:w="1889" w:type="dxa"/>
+            <w:tcMar/>
+          </w:tcPr>
+          <w:p>
+            <w:pPr>
+              <w:pStyle w:val="Normal"/>
+              <w:jc w:val="center"/>
+              <w:rPr>
+                <w:rFonts w:ascii="Times New Roman" w:hAnsi="Times New Roman" w:cs="Times New Roman"/>
+                <w:sz w:val="22"/>
+                <w:szCs w:val="22"/>
+                <w:lang w:eastAsia="pt-BR"/>
+              </w:rPr>
+            </w:pPr>
+            <w:r>
+              <w:rPr>
+                <w:rFonts w:ascii="Times New Roman" w:hAnsi="Times New Roman" w:cs="Times New Roman"/>
+                <w:sz w:val="22"/>
+                <w:szCs w:val="22"/>
+                <w:lang w:eastAsia="pt-BR"/>
+              </w:rPr>
+              <w:t>Alto</w:t>
+            </w:r>
+          </w:p>
+        </w:tc>
+      </w:tr>
+      <w:tr>
+        <w:trPr>
+          <w:trHeight w:val="300"/>
+        </w:trPr>
+        <w:tc>
+          <w:tcPr>
+            <w:tcW w:w="2122" w:type="dxa"/>
+            <w:tcMar/>
+          </w:tcPr>
+          <w:p>
+            <w:pPr>
+              <w:pStyle w:val="Normal"/>
+              <w:rPr>
+                <w:noProof w:val="0"/>
+                <w:lang w:val="pt-BR"/>
+              </w:rPr>
+            </w:pPr>
+            <w:r>
+              <w:rPr>
+                <w:noProof w:val="0"/>
+                <w:lang w:val="pt-BR"/>
+              </w:rPr>
+              <w:t>Como Desenvolvedor Eu</w:t>
+            </w:r>
+          </w:p>
+          <w:p>
+            <w:pPr>
+              <w:pStyle w:val="Normal"/>
+              <w:jc w:val="left"/>
+              <w:rPr>
+                <w:rFonts w:ascii="Times New Roman" w:hAnsi="Times New Roman" w:cs="Times New Roman"/>
+                <w:sz w:val="22"/>
+                <w:szCs w:val="22"/>
+                <w:lang w:eastAsia="pt-BR"/>
+              </w:rPr>
+            </w:pPr>
+          </w:p>
+        </w:tc>
+        <w:tc>
+          <w:tcPr>
+            <w:tcW w:w="2122" w:type="dxa"/>
+            <w:tcMar/>
+          </w:tcPr>
+          <w:p>
+            <w:pPr>
+              <w:pStyle w:val="Normal"/>
+              <w:jc w:val="left"/>
+              <w:rPr>
+                <w:rFonts w:ascii="Times New Roman" w:hAnsi="Times New Roman" w:cs="Times New Roman"/>
+                <w:sz w:val="22"/>
+                <w:szCs w:val="22"/>
+                <w:lang w:eastAsia="pt-BR"/>
+              </w:rPr>
+            </w:pPr>
+            <w:r>
+              <w:rPr>
+                <w:rFonts w:ascii="Times New Roman" w:hAnsi="Times New Roman" w:cs="Times New Roman"/>
+                <w:sz w:val="22"/>
+                <w:szCs w:val="22"/>
+                <w:lang w:eastAsia="pt-BR"/>
+              </w:rPr>
+              <w:t>Quero que o usuário possa ser físico ou jurídico</w:t>
+            </w:r>
+          </w:p>
+        </w:tc>
+        <w:tc>
+          <w:tcPr>
+            <w:tcW w:w="2355" w:type="dxa"/>
+            <w:tcMar/>
+          </w:tcPr>
+          <w:p>
+            <w:pPr>
+              <w:pStyle w:val="Normal"/>
+              <w:jc w:val="left"/>
+              <w:rPr>
+                <w:rFonts w:ascii="Times New Roman" w:hAnsi="Times New Roman" w:cs="Times New Roman"/>
+                <w:sz w:val="22"/>
+                <w:szCs w:val="22"/>
+                <w:lang w:eastAsia="pt-BR"/>
+              </w:rPr>
+            </w:pPr>
+            <w:r>
+              <w:rPr>
+                <w:rFonts w:ascii="Times New Roman" w:hAnsi="Times New Roman" w:cs="Times New Roman"/>
+                <w:sz w:val="22"/>
+                <w:szCs w:val="22"/>
+                <w:lang w:eastAsia="pt-BR"/>
+              </w:rPr>
+              <w:t>ONG’s</w:t>
+            </w:r>
+            <w:r>
+              <w:rPr>
+                <w:rFonts w:ascii="Times New Roman" w:hAnsi="Times New Roman" w:cs="Times New Roman"/>
+                <w:sz w:val="22"/>
+                <w:szCs w:val="22"/>
+                <w:lang w:eastAsia="pt-BR"/>
+              </w:rPr>
+              <w:t xml:space="preserve">, Petshops e </w:t>
+            </w:r>
+            <w:r>
+              <w:rPr>
+                <w:rFonts w:ascii="Times New Roman" w:hAnsi="Times New Roman" w:cs="Times New Roman"/>
+                <w:sz w:val="22"/>
+                <w:szCs w:val="22"/>
+                <w:lang w:eastAsia="pt-BR"/>
+              </w:rPr>
+              <w:t>Clinicas</w:t>
+            </w:r>
+            <w:r>
+              <w:rPr>
+                <w:rFonts w:ascii="Times New Roman" w:hAnsi="Times New Roman" w:cs="Times New Roman"/>
+                <w:sz w:val="22"/>
+                <w:szCs w:val="22"/>
+                <w:lang w:eastAsia="pt-BR"/>
+              </w:rPr>
+              <w:t xml:space="preserve"> veterinárias possam se cadastrar além dos usuários</w:t>
+            </w:r>
+          </w:p>
+        </w:tc>
+        <w:tc>
+          <w:tcPr>
+            <w:tcW w:w="1889" w:type="dxa"/>
+            <w:tcMar/>
+          </w:tcPr>
+          <w:p>
+            <w:pPr>
+              <w:pStyle w:val="Normal"/>
+              <w:jc w:val="center"/>
+              <w:rPr>
+                <w:rFonts w:ascii="Times New Roman" w:hAnsi="Times New Roman" w:cs="Times New Roman"/>
+                <w:sz w:val="22"/>
+                <w:szCs w:val="22"/>
+                <w:lang w:eastAsia="pt-BR"/>
+              </w:rPr>
+            </w:pPr>
+            <w:r>
+              <w:rPr>
+                <w:rFonts w:ascii="Times New Roman" w:hAnsi="Times New Roman" w:cs="Times New Roman"/>
+                <w:sz w:val="22"/>
+                <w:szCs w:val="22"/>
+                <w:lang w:eastAsia="pt-BR"/>
+              </w:rPr>
+              <w:t>Alto</w:t>
+            </w:r>
+          </w:p>
+        </w:tc>
+      </w:tr>
+      <w:tr>
+        <w:trPr>
+          <w:trHeight w:val="300"/>
+        </w:trPr>
+        <w:tc>
+          <w:tcPr>
+            <w:tcW w:w="2122" w:type="dxa"/>
+            <w:tcMar/>
+          </w:tcPr>
+          <w:p>
+            <w:pPr>
+              <w:pStyle w:val="Normal"/>
+              <w:rPr>
+                <w:noProof w:val="0"/>
+                <w:lang w:val="pt-BR"/>
+              </w:rPr>
+            </w:pPr>
+            <w:r>
+              <w:rPr>
+                <w:noProof w:val="0"/>
+                <w:lang w:val="pt-BR"/>
+              </w:rPr>
+              <w:t>Como Desenvolvedor Eu</w:t>
+            </w:r>
+          </w:p>
+          <w:p>
+            <w:pPr>
+              <w:pStyle w:val="Normal"/>
+              <w:jc w:val="left"/>
+              <w:rPr>
+                <w:rFonts w:ascii="Times New Roman" w:hAnsi="Times New Roman" w:cs="Times New Roman"/>
+                <w:sz w:val="22"/>
+                <w:szCs w:val="22"/>
+                <w:lang w:eastAsia="pt-BR"/>
+              </w:rPr>
+            </w:pPr>
+          </w:p>
+        </w:tc>
+        <w:tc>
+          <w:tcPr>
+            <w:tcW w:w="2122" w:type="dxa"/>
+            <w:tcMar/>
+          </w:tcPr>
+          <w:p>
+            <w:pPr>
+              <w:pStyle w:val="Normal"/>
+              <w:jc w:val="left"/>
+              <w:rPr>
+                <w:rFonts w:ascii="Times New Roman" w:hAnsi="Times New Roman" w:cs="Times New Roman"/>
+                <w:sz w:val="22"/>
+                <w:szCs w:val="22"/>
+                <w:lang w:eastAsia="pt-BR"/>
+              </w:rPr>
+            </w:pPr>
+            <w:r>
+              <w:rPr>
+                <w:rFonts w:ascii="Times New Roman" w:hAnsi="Times New Roman" w:cs="Times New Roman"/>
+                <w:sz w:val="22"/>
+                <w:szCs w:val="22"/>
+                <w:lang w:eastAsia="pt-BR"/>
+              </w:rPr>
+              <w:t>Se possa cadastrar pets para adoção</w:t>
+            </w:r>
+          </w:p>
+        </w:tc>
+        <w:tc>
+          <w:tcPr>
+            <w:tcW w:w="2355" w:type="dxa"/>
+            <w:tcMar/>
+          </w:tcPr>
+          <w:p>
+            <w:pPr>
+              <w:pStyle w:val="Normal"/>
+              <w:suppressLineNumbers w:val="0"/>
+              <w:bidi w:val="0"/>
+              <w:spacing w:before="0" w:beforeAutospacing="off" w:after="200" w:afterAutospacing="off" w:line="276" w:lineRule="auto"/>
+              <w:ind w:left="0" w:right="0"/>
+              <w:jc w:val="left"/>
+              <w:rPr>
+                <w:rFonts w:ascii="Times New Roman" w:hAnsi="Times New Roman" w:cs="Times New Roman"/>
+                <w:sz w:val="22"/>
+                <w:szCs w:val="22"/>
+                <w:lang w:eastAsia="pt-BR"/>
+              </w:rPr>
+            </w:pPr>
+            <w:r>
+              <w:rPr>
+                <w:rFonts w:ascii="Times New Roman" w:hAnsi="Times New Roman" w:cs="Times New Roman"/>
+                <w:sz w:val="22"/>
+                <w:szCs w:val="22"/>
+                <w:lang w:eastAsia="pt-BR"/>
+              </w:rPr>
+              <w:t xml:space="preserve">Para que animais </w:t>
+            </w:r>
+            <w:r>
+              <w:rPr>
+                <w:rFonts w:ascii="Times New Roman" w:hAnsi="Times New Roman" w:cs="Times New Roman"/>
+                <w:sz w:val="22"/>
+                <w:szCs w:val="22"/>
+                <w:lang w:eastAsia="pt-BR"/>
+              </w:rPr>
+              <w:t>órfãos</w:t>
+            </w:r>
+            <w:r>
+              <w:rPr>
+                <w:rFonts w:ascii="Times New Roman" w:hAnsi="Times New Roman" w:cs="Times New Roman"/>
+                <w:sz w:val="22"/>
+                <w:szCs w:val="22"/>
+                <w:lang w:eastAsia="pt-BR"/>
+              </w:rPr>
+              <w:t xml:space="preserve"> </w:t>
+            </w:r>
+            <w:r>
+              <w:rPr>
+                <w:rFonts w:ascii="Times New Roman" w:hAnsi="Times New Roman" w:cs="Times New Roman"/>
+                <w:sz w:val="22"/>
+                <w:szCs w:val="22"/>
+                <w:lang w:eastAsia="pt-BR"/>
+              </w:rPr>
+              <w:t>possa</w:t>
+            </w:r>
+            <w:r>
+              <w:rPr>
+                <w:rFonts w:ascii="Times New Roman" w:hAnsi="Times New Roman" w:cs="Times New Roman"/>
+                <w:sz w:val="22"/>
+                <w:szCs w:val="22"/>
+                <w:lang w:eastAsia="pt-BR"/>
+              </w:rPr>
+              <w:t>m</w:t>
+            </w:r>
+            <w:r>
+              <w:rPr>
+                <w:rFonts w:ascii="Times New Roman" w:hAnsi="Times New Roman" w:cs="Times New Roman"/>
+                <w:sz w:val="22"/>
+                <w:szCs w:val="22"/>
+                <w:lang w:eastAsia="pt-BR"/>
+              </w:rPr>
+              <w:t xml:space="preserve"> encontrar uma família</w:t>
+            </w:r>
+          </w:p>
+        </w:tc>
+        <w:tc>
+          <w:tcPr>
+            <w:tcW w:w="1889" w:type="dxa"/>
+            <w:tcMar/>
+          </w:tcPr>
+          <w:p>
+            <w:pPr>
+              <w:pStyle w:val="Normal"/>
+              <w:jc w:val="center"/>
+              <w:rPr>
+                <w:rFonts w:ascii="Times New Roman" w:hAnsi="Times New Roman" w:cs="Times New Roman"/>
+                <w:sz w:val="22"/>
+                <w:szCs w:val="22"/>
+                <w:lang w:eastAsia="pt-BR"/>
+              </w:rPr>
+            </w:pPr>
+            <w:r>
+              <w:rPr>
+                <w:rFonts w:ascii="Times New Roman" w:hAnsi="Times New Roman" w:cs="Times New Roman"/>
+                <w:sz w:val="22"/>
+                <w:szCs w:val="22"/>
+                <w:lang w:eastAsia="pt-BR"/>
+              </w:rPr>
+              <w:t>Alto</w:t>
+            </w:r>
+          </w:p>
+        </w:tc>
+      </w:tr>
+    </w:tbl>
+    <w:p>
+      <w:pPr>
+        <w:pStyle w:val="Normal"/>
         <w:rPr>
           <w:rFonts w:ascii="Times New Roman" w:hAnsi="Times New Roman" w:cs="Times New Roman"/>
           <w:sz w:val="24"/>
@@ -260,7 +1158,7 @@
     <w:sectPr>
       <w:headerReference w:type="default" r:id="rId6"/>
       <w:footerReference w:type="default" r:id="rId7"/>
-      <w:pgSz w:w="11906" w:h="16838"/>
+      <w:pgSz w:w="11906" w:h="16838" w:orient="portrait"/>
       <w:pgMar w:top="1417" w:right="1701" w:bottom="1417" w:left="1701" w:header="708" w:footer="708" w:gutter="0"/>
       <w:cols w:space="708"/>
       <w:docGrid w:linePitch="360"/>
@@ -272,7 +1170,7 @@
 <file path=word/endnotes.xml><?xml version="1.0" encoding="utf-8"?>
 <w:endnotes xmlns:wpc="http://schemas.microsoft.com/office/word/2010/wordprocessingCanvas" xmlns:cx="http://schemas.microsoft.com/office/drawing/2014/chartex" xmlns:cx1="http://schemas.microsoft.com/office/drawing/2015/9/8/chartex" xmlns:mc="http://schemas.openxmlformats.org/markup-compatibility/2006" xmlns:o="urn:schemas-microsoft-com:office:office" xmlns:r="http://schemas.openxmlformats.org/officeDocument/2006/relationships" xmlns:m="http://schemas.openxmlformats.org/officeDocument/2006/math" xmlns:v="urn:schemas-microsoft-com:vml" xmlns:wp14="http://schemas.microsoft.com/office/word/2010/wordprocessingDrawing" xmlns:wp="http://schemas.openxmlformats.org/drawingml/2006/wordprocessingDrawing" xmlns:w10="urn:schemas-microsoft-com:office:word" xmlns:w="http://schemas.openxmlformats.org/wordprocessingml/2006/main" xmlns:w14="http://schemas.microsoft.com/office/word/2010/wordml" xmlns:w15="http://schemas.microsoft.com/office/word/2012/wordml" xmlns:w16se="http://schemas.microsoft.com/office/word/2015/wordml/symex" xmlns:wpg="http://schemas.microsoft.com/office/word/2010/wordprocessingGroup" xmlns:wpi="http://schemas.microsoft.com/office/word/2010/wordprocessingInk" xmlns:wne="http://schemas.microsoft.com/office/word/2006/wordml" xmlns:wps="http://schemas.microsoft.com/office/word/2010/wordprocessingShape" mc:Ignorable="w14 w15 w16se wp14">
   <w:endnote w:type="separator" w:id="-1">
-    <w:p>
+    <w:p xmlns:wp14="http://schemas.microsoft.com/office/word/2010/wordml" wp14:textId="77777777">
       <w:pPr>
         <w:spacing w:after="0" w:line="240" w:lineRule="auto"/>
       </w:pPr>
@@ -282,7 +1180,7 @@
     </w:p>
   </w:endnote>
   <w:endnote w:type="continuationSeparator" w:id="0">
-    <w:p>
+    <w:p xmlns:wp14="http://schemas.microsoft.com/office/word/2010/wordml" wp14:textId="77777777">
       <w:pPr>
         <w:spacing w:after="0" w:line="240" w:lineRule="auto"/>
       </w:pPr>
@@ -296,7 +1194,7 @@
 
 <file path=word/footer1.xml><?xml version="1.0" encoding="utf-8"?>
 <w:ftr xmlns:wpc="http://schemas.microsoft.com/office/word/2010/wordprocessingCanvas" xmlns:cx="http://schemas.microsoft.com/office/drawing/2014/chartex" xmlns:cx1="http://schemas.microsoft.com/office/drawing/2015/9/8/chartex" xmlns:mc="http://schemas.openxmlformats.org/markup-compatibility/2006" xmlns:o="urn:schemas-microsoft-com:office:office" xmlns:r="http://schemas.openxmlformats.org/officeDocument/2006/relationships" xmlns:m="http://schemas.openxmlformats.org/officeDocument/2006/math" xmlns:v="urn:schemas-microsoft-com:vml" xmlns:wp14="http://schemas.microsoft.com/office/word/2010/wordprocessingDrawing" xmlns:wp="http://schemas.openxmlformats.org/drawingml/2006/wordprocessingDrawing" xmlns:w10="urn:schemas-microsoft-com:office:word" xmlns:w="http://schemas.openxmlformats.org/wordprocessingml/2006/main" xmlns:w14="http://schemas.microsoft.com/office/word/2010/wordml" xmlns:w15="http://schemas.microsoft.com/office/word/2012/wordml" xmlns:w16se="http://schemas.microsoft.com/office/word/2015/wordml/symex" xmlns:wpg="http://schemas.microsoft.com/office/word/2010/wordprocessingGroup" xmlns:wpi="http://schemas.microsoft.com/office/word/2010/wordprocessingInk" xmlns:wne="http://schemas.microsoft.com/office/word/2006/wordml" xmlns:wps="http://schemas.microsoft.com/office/word/2010/wordprocessingShape" mc:Ignorable="w14 w15 w16se wp14">
-  <w:p>
+  <w:p xmlns:wp14="http://schemas.microsoft.com/office/word/2010/wordml" wp14:textId="77777777">
     <w:pPr>
       <w:pStyle w:val="Rodap"/>
       <w:jc w:val="center"/>
@@ -411,7 +1309,7 @@
 <file path=word/footnotes.xml><?xml version="1.0" encoding="utf-8"?>
 <w:footnotes xmlns:wpc="http://schemas.microsoft.com/office/word/2010/wordprocessingCanvas" xmlns:cx="http://schemas.microsoft.com/office/drawing/2014/chartex" xmlns:cx1="http://schemas.microsoft.com/office/drawing/2015/9/8/chartex" xmlns:mc="http://schemas.openxmlformats.org/markup-compatibility/2006" xmlns:o="urn:schemas-microsoft-com:office:office" xmlns:r="http://schemas.openxmlformats.org/officeDocument/2006/relationships" xmlns:m="http://schemas.openxmlformats.org/officeDocument/2006/math" xmlns:v="urn:schemas-microsoft-com:vml" xmlns:wp14="http://schemas.microsoft.com/office/word/2010/wordprocessingDrawing" xmlns:wp="http://schemas.openxmlformats.org/drawingml/2006/wordprocessingDrawing" xmlns:w10="urn:schemas-microsoft-com:office:word" xmlns:w="http://schemas.openxmlformats.org/wordprocessingml/2006/main" xmlns:w14="http://schemas.microsoft.com/office/word/2010/wordml" xmlns:w15="http://schemas.microsoft.com/office/word/2012/wordml" xmlns:w16se="http://schemas.microsoft.com/office/word/2015/wordml/symex" xmlns:wpg="http://schemas.microsoft.com/office/word/2010/wordprocessingGroup" xmlns:wpi="http://schemas.microsoft.com/office/word/2010/wordprocessingInk" xmlns:wne="http://schemas.microsoft.com/office/word/2006/wordml" xmlns:wps="http://schemas.microsoft.com/office/word/2010/wordprocessingShape" mc:Ignorable="w14 w15 w16se wp14">
   <w:footnote w:type="separator" w:id="-1">
-    <w:p>
+    <w:p xmlns:wp14="http://schemas.microsoft.com/office/word/2010/wordml" wp14:textId="77777777">
       <w:pPr>
         <w:spacing w:after="0" w:line="240" w:lineRule="auto"/>
       </w:pPr>
@@ -421,7 +1319,7 @@
     </w:p>
   </w:footnote>
   <w:footnote w:type="continuationSeparator" w:id="0">
-    <w:p>
+    <w:p xmlns:wp14="http://schemas.microsoft.com/office/word/2010/wordml" wp14:textId="77777777">
       <w:pPr>
         <w:spacing w:after="0" w:line="240" w:lineRule="auto"/>
       </w:pPr>
@@ -435,7 +1333,7 @@
 
 <file path=word/header1.xml><?xml version="1.0" encoding="utf-8"?>
 <w:hdr xmlns:wpc="http://schemas.microsoft.com/office/word/2010/wordprocessingCanvas" xmlns:cx="http://schemas.microsoft.com/office/drawing/2014/chartex" xmlns:cx1="http://schemas.microsoft.com/office/drawing/2015/9/8/chartex" xmlns:mc="http://schemas.openxmlformats.org/markup-compatibility/2006" xmlns:o="urn:schemas-microsoft-com:office:office" xmlns:r="http://schemas.openxmlformats.org/officeDocument/2006/relationships" xmlns:m="http://schemas.openxmlformats.org/officeDocument/2006/math" xmlns:v="urn:schemas-microsoft-com:vml" xmlns:wp14="http://schemas.microsoft.com/office/word/2010/wordprocessingDrawing" xmlns:wp="http://schemas.openxmlformats.org/drawingml/2006/wordprocessingDrawing" xmlns:w10="urn:schemas-microsoft-com:office:word" xmlns:w="http://schemas.openxmlformats.org/wordprocessingml/2006/main" xmlns:w14="http://schemas.microsoft.com/office/word/2010/wordml" xmlns:w15="http://schemas.microsoft.com/office/word/2012/wordml" xmlns:w16se="http://schemas.microsoft.com/office/word/2015/wordml/symex" xmlns:wpg="http://schemas.microsoft.com/office/word/2010/wordprocessingGroup" xmlns:wpi="http://schemas.microsoft.com/office/word/2010/wordprocessingInk" xmlns:wne="http://schemas.microsoft.com/office/word/2006/wordml" xmlns:wps="http://schemas.microsoft.com/office/word/2010/wordprocessingShape" mc:Ignorable="w14 w15 w16se wp14">
-  <w:p>
+  <w:p xmlns:wp14="http://schemas.microsoft.com/office/word/2010/wordml" wp14:textId="77777777">
     <w:pPr>
       <w:pStyle w:val="Cabealho"/>
       <w:jc w:val="center"/>
@@ -450,11 +1348,11 @@
 </file>
 
 <file path=word/styles.xml><?xml version="1.0" encoding="utf-8"?>
-<w:styles xmlns:mc="http://schemas.openxmlformats.org/markup-compatibility/2006" xmlns:r="http://schemas.openxmlformats.org/officeDocument/2006/relationships" xmlns:w="http://schemas.openxmlformats.org/wordprocessingml/2006/main" xmlns:w14="http://schemas.microsoft.com/office/word/2010/wordml" xmlns:w15="http://schemas.microsoft.com/office/word/2012/wordml" xmlns:w16se="http://schemas.microsoft.com/office/word/2015/wordml/symex" mc:Ignorable="w14 w15 w16se">
+<w:styles xmlns:wp14="http://schemas.microsoft.com/office/word/2010/wordprocessingDrawing" xmlns:mc="http://schemas.openxmlformats.org/markup-compatibility/2006" xmlns:r="http://schemas.openxmlformats.org/officeDocument/2006/relationships" xmlns:w="http://schemas.openxmlformats.org/wordprocessingml/2006/main" xmlns:w14="http://schemas.microsoft.com/office/word/2010/wordml" xmlns:w15="http://schemas.microsoft.com/office/word/2012/wordml" xmlns:w16se="http://schemas.microsoft.com/office/word/2015/wordml/symex" mc:Ignorable="w14 w15 w16se wp14">
   <w:docDefaults>
     <w:rPrDefault>
       <w:rPr>
-        <w:rFonts w:asciiTheme="minorHAnsi" w:eastAsiaTheme="minorHAnsi" w:hAnsiTheme="minorHAnsi" w:cstheme="minorBidi"/>
+        <w:rFonts w:asciiTheme="minorHAnsi" w:hAnsiTheme="minorHAnsi" w:eastAsiaTheme="minorHAnsi" w:cstheme="minorBidi"/>
         <w:sz w:val="22"/>
         <w:szCs w:val="22"/>
         <w:lang w:val="pt-BR" w:eastAsia="en-US" w:bidi="ar-SA"/>
@@ -469,14 +1367,14 @@
   <w:latentStyles w:defLockedState="0" w:defUIPriority="99" w:defSemiHidden="0" w:defUnhideWhenUsed="0" w:defQFormat="0" w:count="371">
     <w:lsdException w:name="Normal" w:uiPriority="0" w:qFormat="1"/>
     <w:lsdException w:name="heading 1" w:uiPriority="9" w:qFormat="1"/>
-    <w:lsdException w:name="heading 2" w:semiHidden="1" w:uiPriority="9" w:unhideWhenUsed="1" w:qFormat="1"/>
-    <w:lsdException w:name="heading 3" w:semiHidden="1" w:uiPriority="9" w:unhideWhenUsed="1" w:qFormat="1"/>
-    <w:lsdException w:name="heading 4" w:semiHidden="1" w:uiPriority="9" w:unhideWhenUsed="1" w:qFormat="1"/>
-    <w:lsdException w:name="heading 5" w:semiHidden="1" w:uiPriority="9" w:unhideWhenUsed="1" w:qFormat="1"/>
-    <w:lsdException w:name="heading 6" w:semiHidden="1" w:uiPriority="9" w:unhideWhenUsed="1" w:qFormat="1"/>
-    <w:lsdException w:name="heading 7" w:semiHidden="1" w:uiPriority="9" w:unhideWhenUsed="1" w:qFormat="1"/>
-    <w:lsdException w:name="heading 8" w:semiHidden="1" w:uiPriority="9" w:unhideWhenUsed="1" w:qFormat="1"/>
-    <w:lsdException w:name="heading 9" w:semiHidden="1" w:uiPriority="9" w:unhideWhenUsed="1" w:qFormat="1"/>
+    <w:lsdException w:name="heading 2" w:uiPriority="9" w:semiHidden="1" w:unhideWhenUsed="1" w:qFormat="1"/>
+    <w:lsdException w:name="heading 3" w:uiPriority="9" w:semiHidden="1" w:unhideWhenUsed="1" w:qFormat="1"/>
+    <w:lsdException w:name="heading 4" w:uiPriority="9" w:semiHidden="1" w:unhideWhenUsed="1" w:qFormat="1"/>
+    <w:lsdException w:name="heading 5" w:uiPriority="9" w:semiHidden="1" w:unhideWhenUsed="1" w:qFormat="1"/>
+    <w:lsdException w:name="heading 6" w:uiPriority="9" w:semiHidden="1" w:unhideWhenUsed="1" w:qFormat="1"/>
+    <w:lsdException w:name="heading 7" w:uiPriority="9" w:semiHidden="1" w:unhideWhenUsed="1" w:qFormat="1"/>
+    <w:lsdException w:name="heading 8" w:uiPriority="9" w:semiHidden="1" w:unhideWhenUsed="1" w:qFormat="1"/>
+    <w:lsdException w:name="heading 9" w:uiPriority="9" w:semiHidden="1" w:unhideWhenUsed="1" w:qFormat="1"/>
     <w:lsdException w:name="index 1" w:semiHidden="1" w:unhideWhenUsed="1"/>
     <w:lsdException w:name="index 2" w:semiHidden="1" w:unhideWhenUsed="1"/>
     <w:lsdException w:name="index 3" w:semiHidden="1" w:unhideWhenUsed="1"/>
@@ -486,22 +1384,22 @@
     <w:lsdException w:name="index 7" w:semiHidden="1" w:unhideWhenUsed="1"/>
     <w:lsdException w:name="index 8" w:semiHidden="1" w:unhideWhenUsed="1"/>
     <w:lsdException w:name="index 9" w:semiHidden="1" w:unhideWhenUsed="1"/>
-    <w:lsdException w:name="toc 1" w:semiHidden="1" w:uiPriority="39" w:unhideWhenUsed="1"/>
-    <w:lsdException w:name="toc 2" w:semiHidden="1" w:uiPriority="39" w:unhideWhenUsed="1"/>
-    <w:lsdException w:name="toc 3" w:semiHidden="1" w:uiPriority="39" w:unhideWhenUsed="1"/>
-    <w:lsdException w:name="toc 4" w:semiHidden="1" w:uiPriority="39" w:unhideWhenUsed="1"/>
-    <w:lsdException w:name="toc 5" w:semiHidden="1" w:uiPriority="39" w:unhideWhenUsed="1"/>
-    <w:lsdException w:name="toc 6" w:semiHidden="1" w:uiPriority="39" w:unhideWhenUsed="1"/>
-    <w:lsdException w:name="toc 7" w:semiHidden="1" w:uiPriority="39" w:unhideWhenUsed="1"/>
-    <w:lsdException w:name="toc 8" w:semiHidden="1" w:uiPriority="39" w:unhideWhenUsed="1"/>
-    <w:lsdException w:name="toc 9" w:semiHidden="1" w:uiPriority="39" w:unhideWhenUsed="1"/>
+    <w:lsdException w:name="toc 1" w:uiPriority="39" w:semiHidden="1" w:unhideWhenUsed="1"/>
+    <w:lsdException w:name="toc 2" w:uiPriority="39" w:semiHidden="1" w:unhideWhenUsed="1"/>
+    <w:lsdException w:name="toc 3" w:uiPriority="39" w:semiHidden="1" w:unhideWhenUsed="1"/>
+    <w:lsdException w:name="toc 4" w:uiPriority="39" w:semiHidden="1" w:unhideWhenUsed="1"/>
+    <w:lsdException w:name="toc 5" w:uiPriority="39" w:semiHidden="1" w:unhideWhenUsed="1"/>
+    <w:lsdException w:name="toc 6" w:uiPriority="39" w:semiHidden="1" w:unhideWhenUsed="1"/>
+    <w:lsdException w:name="toc 7" w:uiPriority="39" w:semiHidden="1" w:unhideWhenUsed="1"/>
+    <w:lsdException w:name="toc 8" w:uiPriority="39" w:semiHidden="1" w:unhideWhenUsed="1"/>
+    <w:lsdException w:name="toc 9" w:uiPriority="39" w:semiHidden="1" w:unhideWhenUsed="1"/>
     <w:lsdException w:name="Normal Indent" w:semiHidden="1" w:unhideWhenUsed="1"/>
     <w:lsdException w:name="footnote text" w:semiHidden="1" w:unhideWhenUsed="1"/>
     <w:lsdException w:name="annotation text" w:semiHidden="1" w:unhideWhenUsed="1"/>
     <w:lsdException w:name="header" w:semiHidden="1" w:unhideWhenUsed="1"/>
     <w:lsdException w:name="footer" w:semiHidden="1" w:unhideWhenUsed="1"/>
     <w:lsdException w:name="index heading" w:semiHidden="1" w:unhideWhenUsed="1"/>
-    <w:lsdException w:name="caption" w:semiHidden="1" w:uiPriority="35" w:unhideWhenUsed="1" w:qFormat="1"/>
+    <w:lsdException w:name="caption" w:uiPriority="35" w:semiHidden="1" w:unhideWhenUsed="1" w:qFormat="1"/>
     <w:lsdException w:name="table of figures" w:semiHidden="1" w:unhideWhenUsed="1"/>
     <w:lsdException w:name="envelope address" w:semiHidden="1" w:unhideWhenUsed="1"/>
     <w:lsdException w:name="envelope return" w:semiHidden="1" w:unhideWhenUsed="1"/>
@@ -532,7 +1430,7 @@
     <w:lsdException w:name="Title" w:uiPriority="10" w:qFormat="1"/>
     <w:lsdException w:name="Closing" w:semiHidden="1" w:unhideWhenUsed="1"/>
     <w:lsdException w:name="Signature" w:semiHidden="1" w:unhideWhenUsed="1"/>
-    <w:lsdException w:name="Default Paragraph Font" w:semiHidden="1" w:uiPriority="1" w:unhideWhenUsed="1"/>
+    <w:lsdException w:name="Default Paragraph Font" w:uiPriority="1" w:semiHidden="1" w:unhideWhenUsed="1"/>
     <w:lsdException w:name="Body Text" w:semiHidden="1" w:unhideWhenUsed="1"/>
     <w:lsdException w:name="Body Text Indent" w:semiHidden="1" w:unhideWhenUsed="1"/>
     <w:lsdException w:name="List Continue" w:semiHidden="1" w:unhideWhenUsed="1"/>
@@ -732,8 +1630,8 @@
     <w:lsdException w:name="Subtle Reference" w:uiPriority="31" w:qFormat="1"/>
     <w:lsdException w:name="Intense Reference" w:uiPriority="32" w:qFormat="1"/>
     <w:lsdException w:name="Book Title" w:uiPriority="33" w:qFormat="1"/>
-    <w:lsdException w:name="Bibliography" w:semiHidden="1" w:uiPriority="37" w:unhideWhenUsed="1"/>
-    <w:lsdException w:name="TOC Heading" w:semiHidden="1" w:uiPriority="39" w:unhideWhenUsed="1" w:qFormat="1"/>
+    <w:lsdException w:name="Bibliography" w:uiPriority="37" w:semiHidden="1" w:unhideWhenUsed="1"/>
+    <w:lsdException w:name="TOC Heading" w:uiPriority="39" w:semiHidden="1" w:unhideWhenUsed="1" w:qFormat="1"/>
     <w:lsdException w:name="Plain Table 1" w:uiPriority="41"/>
     <w:lsdException w:name="Plain Table 2" w:uiPriority="42"/>
     <w:lsdException w:name="Plain Table 3" w:uiPriority="43"/>
@@ -839,7 +1737,7 @@
     <w:lsdException w:name="List Table 6 Colorful Accent 6" w:uiPriority="51"/>
     <w:lsdException w:name="List Table 7 Colorful Accent 6" w:uiPriority="52"/>
   </w:latentStyles>
-  <w:style w:type="paragraph" w:default="1" w:styleId="Normal">
+  <w:style w:type="paragraph" w:styleId="Normal" w:default="1">
     <w:name w:val="Normal"/>
     <w:qFormat/>
     <w:rsid w:val="004B70AF"/>
@@ -847,7 +1745,7 @@
       <w:spacing w:after="200" w:line="276" w:lineRule="auto"/>
     </w:pPr>
     <w:rPr>
-      <w:rFonts w:ascii="Calibri" w:eastAsia="Calibri" w:hAnsi="Calibri" w:cs="Calibri"/>
+      <w:rFonts w:ascii="Calibri" w:hAnsi="Calibri" w:eastAsia="Calibri" w:cs="Calibri"/>
     </w:rPr>
   </w:style>
   <w:style w:type="paragraph" w:styleId="Ttulo1">
@@ -865,7 +1763,7 @@
       <w:outlineLvl w:val="0"/>
     </w:pPr>
     <w:rPr>
-      <w:rFonts w:asciiTheme="majorHAnsi" w:eastAsiaTheme="majorEastAsia" w:hAnsiTheme="majorHAnsi" w:cstheme="majorBidi"/>
+      <w:rFonts w:asciiTheme="majorHAnsi" w:hAnsiTheme="majorHAnsi" w:eastAsiaTheme="majorEastAsia" w:cstheme="majorBidi"/>
       <w:b/>
       <w:bCs/>
       <w:color w:val="2E74B5" w:themeColor="accent1" w:themeShade="BF"/>
@@ -890,7 +1788,7 @@
       <w:outlineLvl w:val="1"/>
     </w:pPr>
     <w:rPr>
-      <w:rFonts w:asciiTheme="majorHAnsi" w:eastAsiaTheme="majorEastAsia" w:hAnsiTheme="majorHAnsi" w:cstheme="majorBidi"/>
+      <w:rFonts w:asciiTheme="majorHAnsi" w:hAnsiTheme="majorHAnsi" w:eastAsiaTheme="majorEastAsia" w:cstheme="majorBidi"/>
       <w:color w:val="2E74B5" w:themeColor="accent1" w:themeShade="BF"/>
       <w:sz w:val="26"/>
       <w:szCs w:val="26"/>
@@ -912,7 +1810,7 @@
       <w:outlineLvl w:val="2"/>
     </w:pPr>
     <w:rPr>
-      <w:rFonts w:asciiTheme="majorHAnsi" w:eastAsiaTheme="majorEastAsia" w:hAnsiTheme="majorHAnsi" w:cstheme="majorBidi"/>
+      <w:rFonts w:asciiTheme="majorHAnsi" w:hAnsiTheme="majorHAnsi" w:eastAsiaTheme="majorEastAsia" w:cstheme="majorBidi"/>
       <w:color w:val="1F4D78" w:themeColor="accent1" w:themeShade="7F"/>
       <w:sz w:val="24"/>
       <w:szCs w:val="24"/>
@@ -935,7 +1833,7 @@
       <w:outlineLvl w:val="3"/>
     </w:pPr>
     <w:rPr>
-      <w:rFonts w:asciiTheme="majorHAnsi" w:eastAsiaTheme="majorEastAsia" w:hAnsiTheme="majorHAnsi" w:cstheme="majorBidi"/>
+      <w:rFonts w:asciiTheme="majorHAnsi" w:hAnsiTheme="majorHAnsi" w:eastAsiaTheme="majorEastAsia" w:cstheme="majorBidi"/>
       <w:i/>
       <w:iCs/>
       <w:color w:val="2E74B5" w:themeColor="accent1" w:themeShade="BF"/>
@@ -944,13 +1842,13 @@
       <w:lang w:eastAsia="pt-BR"/>
     </w:rPr>
   </w:style>
-  <w:style w:type="character" w:default="1" w:styleId="Fontepargpadro">
+  <w:style w:type="character" w:styleId="Fontepargpadro" w:default="1">
     <w:name w:val="Default Paragraph Font"/>
     <w:uiPriority w:val="1"/>
     <w:semiHidden/>
     <w:unhideWhenUsed/>
   </w:style>
-  <w:style w:type="table" w:default="1" w:styleId="Tabelanormal">
+  <w:style w:type="table" w:styleId="Tabelanormal" w:default="1">
     <w:name w:val="Normal Table"/>
     <w:uiPriority w:val="99"/>
     <w:semiHidden/>
@@ -965,20 +1863,20 @@
       </w:tblCellMar>
     </w:tblPr>
   </w:style>
-  <w:style w:type="numbering" w:default="1" w:styleId="Semlista">
+  <w:style w:type="numbering" w:styleId="Semlista" w:default="1">
     <w:name w:val="No List"/>
     <w:uiPriority w:val="99"/>
     <w:semiHidden/>
     <w:unhideWhenUsed/>
   </w:style>
-  <w:style w:type="character" w:customStyle="1" w:styleId="Ttulo1Char">
+  <w:style w:type="character" w:styleId="Ttulo1Char" w:customStyle="1">
     <w:name w:val="Título 1 Char"/>
     <w:basedOn w:val="Fontepargpadro"/>
     <w:link w:val="Ttulo1"/>
     <w:uiPriority w:val="9"/>
     <w:rsid w:val="004B70AF"/>
     <w:rPr>
-      <w:rFonts w:asciiTheme="majorHAnsi" w:eastAsiaTheme="majorEastAsia" w:hAnsiTheme="majorHAnsi" w:cstheme="majorBidi"/>
+      <w:rFonts w:asciiTheme="majorHAnsi" w:hAnsiTheme="majorHAnsi" w:eastAsiaTheme="majorEastAsia" w:cstheme="majorBidi"/>
       <w:b/>
       <w:bCs/>
       <w:color w:val="2E74B5" w:themeColor="accent1" w:themeShade="BF"/>
@@ -1001,14 +1899,14 @@
       <w:spacing w:after="0" w:line="240" w:lineRule="auto"/>
     </w:pPr>
   </w:style>
-  <w:style w:type="character" w:customStyle="1" w:styleId="CabealhoChar">
+  <w:style w:type="character" w:styleId="CabealhoChar" w:customStyle="1">
     <w:name w:val="Cabeçalho Char"/>
     <w:basedOn w:val="Fontepargpadro"/>
     <w:link w:val="Cabealho"/>
     <w:uiPriority w:val="99"/>
     <w:rsid w:val="008B21D8"/>
     <w:rPr>
-      <w:rFonts w:ascii="Calibri" w:eastAsia="Calibri" w:hAnsi="Calibri" w:cs="Calibri"/>
+      <w:rFonts w:ascii="Calibri" w:hAnsi="Calibri" w:eastAsia="Calibri" w:cs="Calibri"/>
     </w:rPr>
   </w:style>
   <w:style w:type="paragraph" w:styleId="Rodap">
@@ -1026,14 +1924,14 @@
       <w:spacing w:after="0" w:line="240" w:lineRule="auto"/>
     </w:pPr>
   </w:style>
-  <w:style w:type="character" w:customStyle="1" w:styleId="RodapChar">
+  <w:style w:type="character" w:styleId="RodapChar" w:customStyle="1">
     <w:name w:val="Rodapé Char"/>
     <w:basedOn w:val="Fontepargpadro"/>
     <w:link w:val="Rodap"/>
     <w:uiPriority w:val="99"/>
     <w:rsid w:val="008B21D8"/>
     <w:rPr>
-      <w:rFonts w:ascii="Calibri" w:eastAsia="Calibri" w:hAnsi="Calibri" w:cs="Calibri"/>
+      <w:rFonts w:ascii="Calibri" w:hAnsi="Calibri" w:eastAsia="Calibri" w:cs="Calibri"/>
     </w:rPr>
   </w:style>
   <w:style w:type="paragraph" w:styleId="PargrafodaLista">
@@ -1047,7 +1945,7 @@
       <w:contextualSpacing/>
     </w:pPr>
   </w:style>
-  <w:style w:type="character" w:customStyle="1" w:styleId="Ttulo2Char">
+  <w:style w:type="character" w:styleId="Ttulo2Char" w:customStyle="1">
     <w:name w:val="Título 2 Char"/>
     <w:basedOn w:val="Fontepargpadro"/>
     <w:link w:val="Ttulo2"/>
@@ -1055,34 +1953,34 @@
     <w:semiHidden/>
     <w:rsid w:val="00B06E0F"/>
     <w:rPr>
-      <w:rFonts w:asciiTheme="majorHAnsi" w:eastAsiaTheme="majorEastAsia" w:hAnsiTheme="majorHAnsi" w:cstheme="majorBidi"/>
+      <w:rFonts w:asciiTheme="majorHAnsi" w:hAnsiTheme="majorHAnsi" w:eastAsiaTheme="majorEastAsia" w:cstheme="majorBidi"/>
       <w:color w:val="2E74B5" w:themeColor="accent1" w:themeShade="BF"/>
       <w:sz w:val="26"/>
       <w:szCs w:val="26"/>
     </w:rPr>
   </w:style>
-  <w:style w:type="character" w:customStyle="1" w:styleId="Ttulo3Char">
+  <w:style w:type="character" w:styleId="Ttulo3Char" w:customStyle="1">
     <w:name w:val="Título 3 Char"/>
     <w:basedOn w:val="Fontepargpadro"/>
     <w:link w:val="Ttulo3"/>
     <w:uiPriority w:val="9"/>
     <w:rsid w:val="00B06E0F"/>
     <w:rPr>
-      <w:rFonts w:asciiTheme="majorHAnsi" w:eastAsiaTheme="majorEastAsia" w:hAnsiTheme="majorHAnsi" w:cstheme="majorBidi"/>
+      <w:rFonts w:asciiTheme="majorHAnsi" w:hAnsiTheme="majorHAnsi" w:eastAsiaTheme="majorEastAsia" w:cstheme="majorBidi"/>
       <w:color w:val="1F4D78" w:themeColor="accent1" w:themeShade="7F"/>
       <w:sz w:val="24"/>
       <w:szCs w:val="24"/>
       <w:lang w:eastAsia="pt-BR"/>
     </w:rPr>
   </w:style>
-  <w:style w:type="character" w:customStyle="1" w:styleId="Ttulo4Char">
+  <w:style w:type="character" w:styleId="Ttulo4Char" w:customStyle="1">
     <w:name w:val="Título 4 Char"/>
     <w:basedOn w:val="Fontepargpadro"/>
     <w:link w:val="Ttulo4"/>
     <w:uiPriority w:val="9"/>
     <w:rsid w:val="00B06E0F"/>
     <w:rPr>
-      <w:rFonts w:asciiTheme="majorHAnsi" w:eastAsiaTheme="majorEastAsia" w:hAnsiTheme="majorHAnsi" w:cstheme="majorBidi"/>
+      <w:rFonts w:asciiTheme="majorHAnsi" w:hAnsiTheme="majorHAnsi" w:eastAsiaTheme="majorEastAsia" w:cstheme="majorBidi"/>
       <w:i/>
       <w:iCs/>
       <w:color w:val="2E74B5" w:themeColor="accent1" w:themeShade="BF"/>
@@ -1091,11 +1989,37 @@
       <w:lang w:eastAsia="pt-BR"/>
     </w:rPr>
   </w:style>
+  <w:style xmlns:w="http://schemas.openxmlformats.org/wordprocessingml/2006/main" w:type="table" w:styleId="TableGrid">
+    <w:name xmlns:w="http://schemas.openxmlformats.org/wordprocessingml/2006/main" w:val="Table Grid"/>
+    <w:basedOn xmlns:w="http://schemas.openxmlformats.org/wordprocessingml/2006/main" w:val="Tabelanormal"/>
+    <w:uiPriority xmlns:w="http://schemas.openxmlformats.org/wordprocessingml/2006/main" w:val="59"/>
+    <w:rsid xmlns:w="http://schemas.openxmlformats.org/wordprocessingml/2006/main" w:val="00FB4123"/>
+    <w:pPr xmlns:w="http://schemas.openxmlformats.org/wordprocessingml/2006/main">
+      <w:spacing w:after="0" w:line="240" w:lineRule="auto"/>
+    </w:pPr>
+    <w:tblPr xmlns:w="http://schemas.openxmlformats.org/wordprocessingml/2006/main">
+      <w:tblInd w:w="0" w:type="dxa"/>
+      <w:tblBorders>
+        <w:top w:val="single" w:color="000000" w:themeColor="text1" w:sz="4" w:space="0"/>
+        <w:left w:val="single" w:color="000000" w:themeColor="text1" w:sz="4" w:space="0"/>
+        <w:bottom w:val="single" w:color="000000" w:themeColor="text1" w:sz="4" w:space="0"/>
+        <w:right w:val="single" w:color="000000" w:themeColor="text1" w:sz="4" w:space="0"/>
+        <w:insideH w:val="single" w:color="000000" w:themeColor="text1" w:sz="4" w:space="0"/>
+        <w:insideV w:val="single" w:color="000000" w:themeColor="text1" w:sz="4" w:space="0"/>
+      </w:tblBorders>
+      <w:tblCellMar>
+        <w:top w:w="0" w:type="dxa"/>
+        <w:left w:w="108" w:type="dxa"/>
+        <w:bottom w:w="0" w:type="dxa"/>
+        <w:right w:w="108" w:type="dxa"/>
+      </w:tblCellMar>
+    </w:tblPr>
+  </w:style>
 </w:styles>
 </file>
 
 <file path=word/theme/theme1.xml><?xml version="1.0" encoding="utf-8"?>
-<a:theme xmlns:a="http://schemas.openxmlformats.org/drawingml/2006/main" name="Tema do Office">
+<a:theme xmlns:a="http://schemas.openxmlformats.org/drawingml/2006/main" xmlns:thm15="http://schemas.microsoft.com/office/thememl/2012/main" name="Tema do Office">
   <a:themeElements>
     <a:clrScheme name="Escritório">
       <a:dk1>

</xml_diff>